<commit_message>
Add live app screenshots to platform documentation
Embed Import, Worklist QC, liability breakdown, and Candidate Analysis
screenshots at the relevant sections; regenerate the Word doc.

Co-Authored-By: Claude Opus 4.8 <noreply@anthropic.com>
</commit_message>
<xml_diff>
--- a/docs/mRNA_Data_Management_Platform_Documentation.docx
+++ b/docs/mRNA_Data_Management_Platform_Documentation.docx
@@ -36,7 +36,7 @@
         </w:p>
       </w:sdtContent>
     </w:sdt>
-    <w:bookmarkStart w:id="27" w:name="Xc9f51922400d2e3db90724de9e38394d2996973"/>
+    <w:bookmarkStart w:id="39" w:name="Xc9f51922400d2e3db90724de9e38394d2996973"/>
     <w:p>
       <w:pPr>
         <w:pStyle w:val="Heading1"/>
@@ -977,7 +977,7 @@
       </w:r>
     </w:p>
     <w:bookmarkEnd w:id="11"/>
-    <w:bookmarkStart w:id="12" w:name="the-application-tab-by-tab"/>
+    <w:bookmarkStart w:id="18" w:name="the-application-tab-by-tab"/>
     <w:p>
       <w:pPr>
         <w:pStyle w:val="Heading2"/>
@@ -1263,14 +1263,124 @@
       </w:tr>
     </w:tbl>
     <w:p>
+      <w:pPr>
+        <w:pStyle w:val="CaptionedFigure"/>
+      </w:pPr>
+      <w:r>
+        <w:drawing>
+          <wp:inline>
+            <wp:extent cx="5334000" cy="3198115"/>
+            <wp:effectExtent b="0" l="0" r="0" t="0"/>
+            <wp:docPr descr="Import Data — load sequences from CSV/Excel or PostgreSQL; columns auto-map to the structured mRNA model." title="" id="13" name="Picture"/>
+            <a:graphic>
+              <a:graphicData uri="http://schemas.openxmlformats.org/drawingml/2006/picture">
+                <pic:pic>
+                  <pic:nvPicPr>
+                    <pic:cNvPr descr="images/import-data.jpg" id="14" name="Picture"/>
+                    <pic:cNvPicPr>
+                      <a:picLocks noChangeArrowheads="1" noChangeAspect="1"/>
+                    </pic:cNvPicPr>
+                  </pic:nvPicPr>
+                  <pic:blipFill>
+                    <a:blip r:embed="rId12"/>
+                    <a:stretch>
+                      <a:fillRect/>
+                    </a:stretch>
+                  </pic:blipFill>
+                  <pic:spPr bwMode="auto">
+                    <a:xfrm>
+                      <a:off x="0" y="0"/>
+                      <a:ext cx="5334000" cy="3198115"/>
+                    </a:xfrm>
+                    <a:prstGeom prst="rect">
+                      <a:avLst/>
+                    </a:prstGeom>
+                    <a:noFill/>
+                    <a:ln w="9525">
+                      <a:noFill/>
+                      <a:headEnd/>
+                      <a:tailEnd/>
+                    </a:ln>
+                  </pic:spPr>
+                </pic:pic>
+              </a:graphicData>
+            </a:graphic>
+          </wp:inline>
+        </w:drawing>
+      </w:r>
+    </w:p>
+    <w:p>
+      <w:pPr>
+        <w:pStyle w:val="ImageCaption"/>
+      </w:pPr>
+      <w:r>
+        <w:t xml:space="preserve">Import Data — load sequences from CSV/Excel or PostgreSQL; columns auto-map to the structured mRNA model.</w:t>
+      </w:r>
+    </w:p>
+    <w:p>
+      <w:pPr>
+        <w:pStyle w:val="CaptionedFigure"/>
+      </w:pPr>
+      <w:r>
+        <w:drawing>
+          <wp:inline>
+            <wp:extent cx="5334000" cy="3198115"/>
+            <wp:effectExtent b="0" l="0" r="0" t="0"/>
+            <wp:docPr descr="Worklist — the imported panel with base analysis run: GC%, CAI, homopolymers, restriction sites, and the QC score / liabilities count per candidate." title="" id="16" name="Picture"/>
+            <a:graphic>
+              <a:graphicData uri="http://schemas.openxmlformats.org/drawingml/2006/picture">
+                <pic:pic>
+                  <pic:nvPicPr>
+                    <pic:cNvPr descr="images/worklist-qc.jpg" id="17" name="Picture"/>
+                    <pic:cNvPicPr>
+                      <a:picLocks noChangeArrowheads="1" noChangeAspect="1"/>
+                    </pic:cNvPicPr>
+                  </pic:nvPicPr>
+                  <pic:blipFill>
+                    <a:blip r:embed="rId15"/>
+                    <a:stretch>
+                      <a:fillRect/>
+                    </a:stretch>
+                  </pic:blipFill>
+                  <pic:spPr bwMode="auto">
+                    <a:xfrm>
+                      <a:off x="0" y="0"/>
+                      <a:ext cx="5334000" cy="3198115"/>
+                    </a:xfrm>
+                    <a:prstGeom prst="rect">
+                      <a:avLst/>
+                    </a:prstGeom>
+                    <a:noFill/>
+                    <a:ln w="9525">
+                      <a:noFill/>
+                      <a:headEnd/>
+                      <a:tailEnd/>
+                    </a:ln>
+                  </pic:spPr>
+                </pic:pic>
+              </a:graphicData>
+            </a:graphic>
+          </wp:inline>
+        </w:drawing>
+      </w:r>
+    </w:p>
+    <w:p>
+      <w:pPr>
+        <w:pStyle w:val="ImageCaption"/>
+      </w:pPr>
+      <w:r>
+        <w:t xml:space="preserve">Worklist — the imported panel with base analysis run: GC%, CAI, homopolymers, restriction sites, and the QC score / liabilities count per candidate.</w:t>
+      </w:r>
+    </w:p>
+    <w:p>
       <w:r>
         <w:pict>
           <v:rect style="width:0;height:1.5pt" o:hralign="center" o:hrstd="t" o:hr="t"/>
         </w:pict>
       </w:r>
     </w:p>
-    <w:bookmarkEnd w:id="12"/>
-    <w:bookmarkStart w:id="13" w:name="the-analysis-engine"/>
+    <w:bookmarkEnd w:id="18"/>
+    <w:bookmarkStart w:id="19" w:name="the-analysis-engine"/>
     <w:p>
       <w:pPr>
         <w:pStyle w:val="Heading2"/>
@@ -1911,8 +2021,8 @@
         </w:pict>
       </w:r>
     </w:p>
-    <w:bookmarkEnd w:id="13"/>
-    <w:bookmarkStart w:id="14" w:name="liability-qc-scoring"/>
+    <w:bookmarkEnd w:id="19"/>
+    <w:bookmarkStart w:id="23" w:name="liability-qc-scoring"/>
     <w:p>
       <w:pPr>
         <w:pStyle w:val="Heading2"/>
@@ -2155,14 +2265,69 @@
       </w:r>
     </w:p>
     <w:p>
+      <w:pPr>
+        <w:pStyle w:val="CaptionedFigure"/>
+      </w:pPr>
+      <w:r>
+        <w:drawing>
+          <wp:inline>
+            <wp:extent cx="5334000" cy="3198115"/>
+            <wp:effectExtent b="0" l="0" r="0" t="0"/>
+            <wp:docPr descr="Per-sequence liability breakdown — a 0–100 QC score, a pass/review/fail verdict, severity counts, and each flag with its location and recommendation." title="" id="21" name="Picture"/>
+            <a:graphic>
+              <a:graphicData uri="http://schemas.openxmlformats.org/drawingml/2006/picture">
+                <pic:pic>
+                  <pic:nvPicPr>
+                    <pic:cNvPr descr="images/liability-breakdown.jpg" id="22" name="Picture"/>
+                    <pic:cNvPicPr>
+                      <a:picLocks noChangeArrowheads="1" noChangeAspect="1"/>
+                    </pic:cNvPicPr>
+                  </pic:nvPicPr>
+                  <pic:blipFill>
+                    <a:blip r:embed="rId20"/>
+                    <a:stretch>
+                      <a:fillRect/>
+                    </a:stretch>
+                  </pic:blipFill>
+                  <pic:spPr bwMode="auto">
+                    <a:xfrm>
+                      <a:off x="0" y="0"/>
+                      <a:ext cx="5334000" cy="3198115"/>
+                    </a:xfrm>
+                    <a:prstGeom prst="rect">
+                      <a:avLst/>
+                    </a:prstGeom>
+                    <a:noFill/>
+                    <a:ln w="9525">
+                      <a:noFill/>
+                      <a:headEnd/>
+                      <a:tailEnd/>
+                    </a:ln>
+                  </pic:spPr>
+                </pic:pic>
+              </a:graphicData>
+            </a:graphic>
+          </wp:inline>
+        </w:drawing>
+      </w:r>
+    </w:p>
+    <w:p>
+      <w:pPr>
+        <w:pStyle w:val="ImageCaption"/>
+      </w:pPr>
+      <w:r>
+        <w:t xml:space="preserve">Per-sequence liability breakdown — a 0–100 QC score, a pass/review/fail verdict, severity counts, and each flag with its location and recommendation.</w:t>
+      </w:r>
+    </w:p>
+    <w:p>
       <w:r>
         <w:pict>
           <v:rect style="width:0;height:1.5pt" o:hralign="center" o:hrstd="t" o:hr="t"/>
         </w:pict>
       </w:r>
     </w:p>
-    <w:bookmarkEnd w:id="14"/>
-    <w:bookmarkStart w:id="15" w:name="candidate-objective-scoring"/>
+    <w:bookmarkEnd w:id="23"/>
+    <w:bookmarkStart w:id="27" w:name="candidate-objective-scoring"/>
     <w:p>
       <w:pPr>
         <w:pStyle w:val="Heading2"/>
@@ -2447,14 +2612,69 @@
       </w:r>
     </w:p>
     <w:p>
+      <w:pPr>
+        <w:pStyle w:val="CaptionedFigure"/>
+      </w:pPr>
+      <w:r>
+        <w:drawing>
+          <wp:inline>
+            <wp:extent cx="5334000" cy="3198115"/>
+            <wp:effectExtent b="0" l="0" r="0" t="0"/>
+            <wp:docPr descr="Candidate Analysis — the comparison scorecard ranking every candidate across the four objectives, with the top-N shortlist (★) and a per-candidate sequence/structure map below." title="" id="25" name="Picture"/>
+            <a:graphic>
+              <a:graphicData uri="http://schemas.openxmlformats.org/drawingml/2006/picture">
+                <pic:pic>
+                  <pic:nvPicPr>
+                    <pic:cNvPr descr="images/candidate-analysis.jpg" id="26" name="Picture"/>
+                    <pic:cNvPicPr>
+                      <a:picLocks noChangeArrowheads="1" noChangeAspect="1"/>
+                    </pic:cNvPicPr>
+                  </pic:nvPicPr>
+                  <pic:blipFill>
+                    <a:blip r:embed="rId24"/>
+                    <a:stretch>
+                      <a:fillRect/>
+                    </a:stretch>
+                  </pic:blipFill>
+                  <pic:spPr bwMode="auto">
+                    <a:xfrm>
+                      <a:off x="0" y="0"/>
+                      <a:ext cx="5334000" cy="3198115"/>
+                    </a:xfrm>
+                    <a:prstGeom prst="rect">
+                      <a:avLst/>
+                    </a:prstGeom>
+                    <a:noFill/>
+                    <a:ln w="9525">
+                      <a:noFill/>
+                      <a:headEnd/>
+                      <a:tailEnd/>
+                    </a:ln>
+                  </pic:spPr>
+                </pic:pic>
+              </a:graphicData>
+            </a:graphic>
+          </wp:inline>
+        </w:drawing>
+      </w:r>
+    </w:p>
+    <w:p>
+      <w:pPr>
+        <w:pStyle w:val="ImageCaption"/>
+      </w:pPr>
+      <w:r>
+        <w:t xml:space="preserve">Candidate Analysis — the comparison scorecard ranking every candidate across the four objectives, with the top-N shortlist (★) and a per-candidate sequence/structure map below.</w:t>
+      </w:r>
+    </w:p>
+    <w:p>
       <w:r>
         <w:pict>
           <v:rect style="width:0;height:1.5pt" o:hralign="center" o:hrstd="t" o:hr="t"/>
         </w:pict>
       </w:r>
     </w:p>
-    <w:bookmarkEnd w:id="15"/>
-    <w:bookmarkStart w:id="16" w:name="codon-optimization-analysis"/>
+    <w:bookmarkEnd w:id="27"/>
+    <w:bookmarkStart w:id="28" w:name="codon-optimization-analysis"/>
     <w:p>
       <w:pPr>
         <w:pStyle w:val="Heading2"/>
@@ -2614,8 +2834,8 @@
         </w:pict>
       </w:r>
     </w:p>
-    <w:bookmarkEnd w:id="16"/>
-    <w:bookmarkStart w:id="17" w:name="the-model-system-pluggable-ai"/>
+    <w:bookmarkEnd w:id="28"/>
+    <w:bookmarkStart w:id="29" w:name="the-model-system-pluggable-ai"/>
     <w:p>
       <w:pPr>
         <w:pStyle w:val="Heading2"/>
@@ -3010,8 +3230,8 @@
         </w:pict>
       </w:r>
     </w:p>
-    <w:bookmarkEnd w:id="17"/>
-    <w:bookmarkStart w:id="18" w:name="experiment-run-tracking"/>
+    <w:bookmarkEnd w:id="29"/>
+    <w:bookmarkStart w:id="30" w:name="experiment-run-tracking"/>
     <w:p>
       <w:pPr>
         <w:pStyle w:val="Heading2"/>
@@ -3198,8 +3418,8 @@
         </w:pict>
       </w:r>
     </w:p>
-    <w:bookmarkEnd w:id="18"/>
-    <w:bookmarkStart w:id="19" w:name="the-data-layer"/>
+    <w:bookmarkEnd w:id="30"/>
+    <w:bookmarkStart w:id="31" w:name="the-data-layer"/>
     <w:p>
       <w:pPr>
         <w:pStyle w:val="Heading2"/>
@@ -3498,8 +3718,8 @@
         </w:pict>
       </w:r>
     </w:p>
-    <w:bookmarkEnd w:id="19"/>
-    <w:bookmarkStart w:id="20" w:name="configuration"/>
+    <w:bookmarkEnd w:id="31"/>
+    <w:bookmarkStart w:id="32" w:name="configuration"/>
     <w:p>
       <w:pPr>
         <w:pStyle w:val="Heading2"/>
@@ -3771,8 +3991,8 @@
         </w:pict>
       </w:r>
     </w:p>
-    <w:bookmarkEnd w:id="20"/>
-    <w:bookmarkStart w:id="21" w:name="running-it"/>
+    <w:bookmarkEnd w:id="32"/>
+    <w:bookmarkStart w:id="33" w:name="running-it"/>
     <w:p>
       <w:pPr>
         <w:pStyle w:val="Heading2"/>
@@ -4056,8 +4276,8 @@
         </w:pict>
       </w:r>
     </w:p>
-    <w:bookmarkEnd w:id="21"/>
-    <w:bookmarkStart w:id="22" w:name="deployment"/>
+    <w:bookmarkEnd w:id="33"/>
+    <w:bookmarkStart w:id="34" w:name="deployment"/>
     <w:p>
       <w:pPr>
         <w:pStyle w:val="Heading2"/>
@@ -4241,8 +4461,8 @@
         </w:pict>
       </w:r>
     </w:p>
-    <w:bookmarkEnd w:id="22"/>
-    <w:bookmarkStart w:id="23" w:name="testing"/>
+    <w:bookmarkEnd w:id="34"/>
+    <w:bookmarkStart w:id="35" w:name="testing"/>
     <w:p>
       <w:pPr>
         <w:pStyle w:val="Heading2"/>
@@ -4408,8 +4628,8 @@
         </w:pict>
       </w:r>
     </w:p>
-    <w:bookmarkEnd w:id="23"/>
-    <w:bookmarkStart w:id="24" w:name="project-structure"/>
+    <w:bookmarkEnd w:id="35"/>
+    <w:bookmarkStart w:id="36" w:name="project-structure"/>
     <w:p>
       <w:pPr>
         <w:pStyle w:val="Heading2"/>
@@ -4571,8 +4791,8 @@
         </w:pict>
       </w:r>
     </w:p>
-    <w:bookmarkEnd w:id="24"/>
-    <w:bookmarkStart w:id="25" w:name="extending-the-platform"/>
+    <w:bookmarkEnd w:id="36"/>
+    <w:bookmarkStart w:id="37" w:name="extending-the-platform"/>
     <w:p>
       <w:pPr>
         <w:pStyle w:val="Heading2"/>
@@ -4837,8 +5057,8 @@
         </w:pict>
       </w:r>
     </w:p>
-    <w:bookmarkEnd w:id="25"/>
-    <w:bookmarkStart w:id="26" w:name="scope-roadmap"/>
+    <w:bookmarkEnd w:id="37"/>
+    <w:bookmarkStart w:id="38" w:name="scope-roadmap"/>
     <w:p>
       <w:pPr>
         <w:pStyle w:val="Heading2"/>
@@ -4913,8 +5133,8 @@
         <w:t xml:space="preserve">developability. These are the closed-loop and scale roadmap items.</w:t>
       </w:r>
     </w:p>
-    <w:bookmarkEnd w:id="26"/>
-    <w:bookmarkEnd w:id="27"/>
+    <w:bookmarkEnd w:id="38"/>
+    <w:bookmarkEnd w:id="39"/>
     <w:sectPr>
       <w:footnotePr>
         <w:numRestart w:val="eachSect"/>

</xml_diff>